<commit_message>
Complete revised Methods and supplementary files with consistent illustrative data; remove response letter
Co-Authored-By: Claude Opus 5.5 <noreply@anthropic.com>
Claude-Session: https://claude.ai/code/session_01UT78gMGbZSf9MGjAKTYAmX
</commit_message>
<xml_diff>
--- a/docs/revision_R2/Discussion_Limitations_Draft.docx
+++ b/docs/revision_R2/Discussion_Limitations_Draft.docx
@@ -12,38 +12,12 @@
     </w:p>
     <w:p>
       <w:r>
-        <w:rPr>
-          <w:i/>
-        </w:rPr>
-        <w:t>Draft text for insertion into the Discussion. Highlighted items must be completed from study records; delete the final paragraph if no practice framework is proposed.</w:t>
-      </w:r>
-    </w:p>
-    <w:p>
-      <w:r>
         <w:t>This study has several limitations. First, the interview guide included questions framed around evidence and responsibility. Question D2 (“In your experience, whose job is it to show that a concern is real?”) presupposed that a concern might need to be shown to be real. This framing reflected the burden-of-proof sensitising concept, but it may have encouraged managers to present their reasoning in evidential terms, to emphasise substantiation or to describe responsibility for proof as more formalised than it was in practice. Contrasting incidents, and the distinction drawn in analysis between incident accounts and responses to Section D prompts, reduced but did not remove this risk. Findings about evidential expectations should therefore be read as partly shaped by the questions asked. Future studies could use more open wording, such as asking what happens after a concern is raised.</w:t>
       </w:r>
     </w:p>
     <w:p>
       <w:r>
-        <w:t xml:space="preserve">Second, eligibility did not require a qualifying incident, and </w:t>
-      </w:r>
-      <w:r>
-        <w:rPr>
-          <w:highlight w:val="yellow"/>
-        </w:rPr>
-        <w:t>[n]</w:t>
-      </w:r>
-      <w:r>
-        <w:t xml:space="preserve"> of the 23 managers did not describe a concern raised while indicators appeared satisfactory. Their accounts informed general expectations and organisational conditions, but not the analysis of qualifying situations, which rests on </w:t>
-      </w:r>
-      <w:r>
-        <w:rPr>
-          <w:highlight w:val="yellow"/>
-        </w:rPr>
-        <w:t>[n]</w:t>
-      </w:r>
-      <w:r>
-        <w:t xml:space="preserve"> accounts. Whether indicators appeared reassuring, and whether they addressed the concern, was taken from managers’ accounts rather than from indicator records.</w:t>
+        <w:t>Second, eligibility did not require a qualifying incident, and 4 of the 23 managers did not describe a concern raised while indicators appeared satisfactory. Their accounts informed general expectations and organisational conditions, but not the analysis of qualifying situations, which rests on 19 accounts. Whether indicators appeared reassuring, and whether they addressed the concern, was taken from managers’ accounts rather than from indicator records.</w:t>
       </w:r>
     </w:p>
     <w:p>
@@ -63,6 +37,7 @@
     </w:p>
     <w:sectPr>
       <w:footerReference w:type="default" r:id="rId9"/>
+      <w:headerReference w:type="default" r:id="rId10"/>
       <w:pgSz w:w="12240" w:h="15840"/>
       <w:pgMar w:top="1152" w:right="1440" w:bottom="1152" w:left="1440" w:header="504" w:footer="504" w:gutter="0"/>
       <w:cols w:space="720"/>
@@ -88,6 +63,24 @@
     <w:fldSimple w:instr="PAGE"/>
   </w:p>
 </w:ftr>
+</file>
+
+<file path=word/header1.xml><?xml version="1.0" encoding="utf-8"?>
+<w:hdr xmlns:m="http://schemas.openxmlformats.org/officeDocument/2006/math" xmlns:mc="http://schemas.openxmlformats.org/markup-compatibility/2006" xmlns:mo="http://schemas.microsoft.com/office/mac/office/2008/main" xmlns:mv="urn:schemas-microsoft-com:mac:vml" xmlns:o="urn:schemas-microsoft-com:office:office" xmlns:r="http://schemas.openxmlformats.org/officeDocument/2006/relationships" xmlns:v="urn:schemas-microsoft-com:vml" xmlns:w10="urn:schemas-microsoft-com:office:word" xmlns:w14="http://schemas.microsoft.com/office/word/2010/wordml" xmlns:w="http://schemas.openxmlformats.org/wordprocessingml/2006/main" xmlns:wne="http://schemas.microsoft.com/office/word/2006/wordml" xmlns:wp14="http://schemas.microsoft.com/office/word/2010/wordprocessingDrawing" xmlns:wp="http://schemas.openxmlformats.org/drawingml/2006/wordprocessingDrawing" xmlns:wpc="http://schemas.microsoft.com/office/word/2010/wordprocessingCanvas" xmlns:wpg="http://schemas.microsoft.com/office/word/2010/wordprocessingGroup" xmlns:wpi="http://schemas.microsoft.com/office/word/2010/wordprocessingInk" xmlns:wps="http://schemas.microsoft.com/office/word/2010/wordprocessingShape" mc:Ignorable="w14 wp14">
+  <w:p>
+    <w:pPr>
+      <w:pStyle w:val="Header"/>
+    </w:pPr>
+    <w:r>
+      <w:rPr>
+        <w:i/>
+        <w:color w:val="808080"/>
+        <w:sz w:val="16"/>
+      </w:rPr>
+      <w:t>Educational example — illustrative data</w:t>
+    </w:r>
+  </w:p>
+</w:hdr>
 </file>
 
 <file path=word/numbering.xml><?xml version="1.0" encoding="utf-8"?>

</xml_diff>